<commit_message>
Feedback F6: state that moves off best sellers are wrong only when they have stock
Adds the sources' planner stock to each example and the counter-case
where moving off a best seller is right (SCS4 King Graphite, DBS4
Queen White).

Co-Authored-By: Claude Opus 5.5 <noreply@anthropic.com>
Claude-Session: https://claude.ai/code/session_01ECNUyLvUafHehET6NevFNz
</commit_message>
<xml_diff>
--- a/docs/audit-improvements/Audit_Engine_Feedback_Across_Reviews_20260925.docx
+++ b/docs/audit-improvements/Audit_Engine_Feedback_Across_Reviews_20260925.docx
@@ -2648,7 +2648,7 @@
         <w:rPr>
           <w:rFonts w:ascii="Calibri" w:cs="Calibri" w:eastAsia="Calibri" w:hAnsi="Calibri"/>
         </w:rPr>
-        <w:t xml:space="preserve">Stock and the advertised child are the largest single source of wrong rows. The eight runs staged 1,007 child swaps. None can load, 279 are justified by stock, and the stored reviews passed 591 of the rest. The “hero by rule” moved campaigns off the best-selling, best-stocked children onto children that barely sell. 686 renames stamp a child the ad will not serve.</w:t>
+        <w:t xml:space="preserve">Stock and the advertised child are the largest single source of wrong rows. The eight runs staged 1,007 child swaps. None can load, 279 are justified by stock, and the stored reviews passed 591 of the rest. The “hero by rule” moved campaigns off best sellers that still had plenty of stock, onto children that barely sell. 686 renames stamp a child the ad will not serve.</w:t>
       </w:r>
     </w:p>
     <w:p>
@@ -3168,23 +3168,23 @@
         <w:rPr>
           <w:rFonts w:ascii="Calibri" w:cs="Calibri" w:eastAsia="Calibri" w:hAnsi="Calibri"/>
         </w:rPr>
-        <w:t xml:space="preserve">F6. The hero rule moves traffic off the best sellers</w:t>
-      </w:r>
-    </w:p>
-    <w:p>
-      <w:pPr>
-        <w:pStyle w:val="ListParagraph"/>
-        <w:numPr>
-          <w:ilvl w:val="0"/>
-          <w:numId w:val="2"/>
-        </w:numPr>
-        <w:spacing w:after="60"/>
-      </w:pPr>
-      <w:r>
-        <w:rPr>
-          <w:rFonts w:ascii="Calibri" w:cs="Calibri" w:eastAsia="Calibri" w:hAnsi="Calibri"/>
-        </w:rPr>
-        <w:t xml:space="preserve">Seen: DSS4: 86 campaigns ($2,077 and 147 orders in 14 days) move off Queen Black (1,915 units, 20.7 a day, 14.15% CVR on 25,226 paid clicks) onto Stone Grey, which has 18 paid clicks and 1 order. DSS6: 83 campaigns move off Queen and King Black onto white children with 6 and 30 units and no sales. SSS4: 28 move off Grey King (17.63% CVR) onto White King (8.50%). SCS4: Twin campaigns move off Twin Graphite (14.0%) onto Twin White (9.0%, 12 units). The stored reviews passed most of these as “safe” because the target had room.</w:t>
+        <w:t xml:space="preserve">F6. The hero rule moves traffic off best sellers that still have stock</w:t>
+      </w:r>
+    </w:p>
+    <w:p>
+      <w:pPr>
+        <w:pStyle w:val="ListParagraph"/>
+        <w:numPr>
+          <w:ilvl w:val="0"/>
+          <w:numId w:val="2"/>
+        </w:numPr>
+        <w:spacing w:after="60"/>
+      </w:pPr>
+      <w:r>
+        <w:rPr>
+          <w:rFonts w:ascii="Calibri" w:cs="Calibri" w:eastAsia="Calibri" w:hAnsi="Calibri"/>
+        </w:rPr>
+        <w:t xml:space="preserve">Seen: DSS4: 86 campaigns ($2,077 and 147 orders in 14 days) move off Queen Black (1,915 units, 20.7 a day, 14.15% CVR on 25,226 paid clicks) onto Stone Grey, which has 18 paid clicks and 1 order. DSS6: 83 campaigns move off Queen Black (208 units, 258 inbound, 84 days) and King Black (693 units, 401 days) onto white children with 6 and 30 units and no sales. SSS4: 28 move off Grey King (257 units, 110 days, 17.63% CVR) onto White King (8.50%). SCS4: Twin campaigns move off Twin Graphite (64 days, 14.0%) onto Twin White (9.0%, 12 units, nothing inbound). The stored reviews passed most of these as “safe” because the target had room. Moving off a best seller is not wrong in itself. When it is out or at risk, the move is right: SCS4’s King Graphite (the best King seller, 31 units, 15 days) → King White, and DBS4’s Queen White (22 days, next stock in 33) → Queen Olive both pass.</w:t>
       </w:r>
     </w:p>
     <w:p>

</xml_diff>